<commit_message>
feat(labels): rename Review Queue -> JE Review Queue, Narrative -> Variance Analysis
User-facing labels only — routes (/review, /narrative), filenames, type
identifiers, and module paths unchanged so internal contracts stay intact.

Updated:
- Top nav (Layout.tsx)
- Page titles (ReviewQueue.tsx, Narrative.tsx)
- All Link/button text pointing at the queue (AccrualProposal, ContractQueue)
- KB chunk content (fixtures/kb-chunks.json)
- Copilot canned answer for empty queue
</commit_message>
<xml_diff>
--- a/DEMO_SCRIPT.docx
+++ b/DEMO_SCRIPT.docx
@@ -6165,6 +6165,116 @@
           <w:szCs w:val="22"/>
         </w:rPr>
         <w:t xml:space="preserve">It subscribes to the canned JE store in this prototype; in live mode it reads the same proposed_je Postgres table on a refresh. Submit a new JE on /contracts and refresh /narrative → Balance Sheet — Accrued Liabilities updates with the new contract in the contributors list.</w:t>
+      </w:r>
+    </w:p>
+    <w:p>
+      <w:pPr>
+        <w:spacing w:after="40" w:before="160"/>
+      </w:pPr>
+      <w:r>
+        <w:rPr>
+          <w:rFonts w:ascii="Arial" w:cs="Arial" w:eastAsia="Arial" w:hAnsi="Arial"/>
+          <w:b/>
+          <w:bCs/>
+          <w:color w:val="0E7C3A"/>
+          <w:sz w:val="22"/>
+          <w:szCs w:val="22"/>
+        </w:rPr>
+        <w:t xml:space="preserve">Q: </w:t>
+      </w:r>
+      <w:r>
+        <w:rPr>
+          <w:rFonts w:ascii="Arial" w:cs="Arial" w:eastAsia="Arial" w:hAnsi="Arial"/>
+          <w:b/>
+          <w:bCs/>
+          <w:i/>
+          <w:iCs/>
+          <w:color w:val="1F1F1F"/>
+          <w:sz w:val="22"/>
+          <w:szCs w:val="22"/>
+        </w:rPr>
+        <w:t xml:space="preserve">You’re showing a full P&amp;L — how would you actually source this data from Nike?</w:t>
+      </w:r>
+    </w:p>
+    <w:p>
+      <w:pPr>
+        <w:spacing w:after="120" w:before="0"/>
+        <w:ind w:left="240"/>
+      </w:pPr>
+      <w:r>
+        <w:rPr>
+          <w:rFonts w:ascii="Arial" w:cs="Arial" w:eastAsia="Arial" w:hAnsi="Arial"/>
+          <w:b/>
+          <w:bCs/>
+          <w:color w:val="333333"/>
+          <w:sz w:val="22"/>
+          <w:szCs w:val="22"/>
+        </w:rPr>
+        <w:t xml:space="preserve">A: </w:t>
+      </w:r>
+      <w:r>
+        <w:rPr>
+          <w:rFonts w:ascii="Arial" w:cs="Arial" w:eastAsia="Arial" w:hAnsi="Arial"/>
+          <w:color w:val="333333"/>
+          <w:sz w:val="22"/>
+          <w:szCs w:val="22"/>
+        </w:rPr>
+        <w:t xml:space="preserve">Two answers, both real. Today, a structured seedPnL table holds Nike-shaped quarterly figures so the demo runs without a live connection. In production, the Variance Commentary tab is a thin UI over your reporting cube — we’d connect to whichever system holds your management view of the P&amp;L: Foundry, an Anaplan model, a Power BI semantic model, or an SAP S/4HANA Group Reporting / BPC dataset. The agent layer doesn’t change; only the data adapter does. Three integration patterns in order of preference: (1) ODBC/REST against your existing reporting cube — fastest, no new ETL; (2) SAP CDS views directly (I_GLAccountLineItem, I_ProfitabilityActuals) if group reporting lives in S/4HANA — gives GL-line granularity for free; (3) a thin nightly ETL into our Postgres if neither is viable. The decision is governance and freshness — pick what your data team can support.</w:t>
+      </w:r>
+    </w:p>
+    <w:p>
+      <w:pPr>
+        <w:spacing w:after="40" w:before="160"/>
+      </w:pPr>
+      <w:r>
+        <w:rPr>
+          <w:rFonts w:ascii="Arial" w:cs="Arial" w:eastAsia="Arial" w:hAnsi="Arial"/>
+          <w:b/>
+          <w:bCs/>
+          <w:color w:val="0E7C3A"/>
+          <w:sz w:val="22"/>
+          <w:szCs w:val="22"/>
+        </w:rPr>
+        <w:t xml:space="preserve">Q: </w:t>
+      </w:r>
+      <w:r>
+        <w:rPr>
+          <w:rFonts w:ascii="Arial" w:cs="Arial" w:eastAsia="Arial" w:hAnsi="Arial"/>
+          <w:b/>
+          <w:bCs/>
+          <w:i/>
+          <w:iCs/>
+          <w:color w:val="1F1F1F"/>
+          <w:sz w:val="22"/>
+          <w:szCs w:val="22"/>
+        </w:rPr>
+        <w:t xml:space="preserve">Can you do variance commentary at the GL account level — or by GL account groupings — instead of just P&amp;L line items?</w:t>
+      </w:r>
+    </w:p>
+    <w:p>
+      <w:pPr>
+        <w:spacing w:after="120" w:before="0"/>
+        <w:ind w:left="240"/>
+      </w:pPr>
+      <w:r>
+        <w:rPr>
+          <w:rFonts w:ascii="Arial" w:cs="Arial" w:eastAsia="Arial" w:hAnsi="Arial"/>
+          <w:b/>
+          <w:bCs/>
+          <w:color w:val="333333"/>
+          <w:sz w:val="22"/>
+          <w:szCs w:val="22"/>
+        </w:rPr>
+        <w:t xml:space="preserve">A: </w:t>
+      </w:r>
+      <w:r>
+        <w:rPr>
+          <w:rFonts w:ascii="Arial" w:cs="Arial" w:eastAsia="Arial" w:hAnsi="Arial"/>
+          <w:color w:val="333333"/>
+          <w:sz w:val="22"/>
+          <w:szCs w:val="22"/>
+        </w:rPr>
+        <w:t xml:space="preserve">Yes — same agent, different grouping. The variance agent doesn’t care whether the row is “Demand Creation Marketing” or “GL 6210 — Digital Media Spend.” It needs four inputs per row: a name, current period value, prior period value, and a driver context string. To enable GL-level variance: (1) point the data adapter at GL line items instead of P&amp;L roll-ups — same CDS view, lower granularity; (2) optionally apply a grouping layer — a gl_grouping table that maps GL accounts to logical clusters like “Travel &amp; Entertainment”, “Cloud &amp; SaaS”, “Outside Services” — and run the agent at cluster level. Typically we configure both: the cube view shows P&amp;L roll-ups for executive narrative; a drill-down view runs GL-level commentary for controllers investigating a specific bucket. Drill-down can fire on demand (controller clicks a high-variance line) or in a nightly batch for the close pack. Materiality threshold per group is configurable so you don’t get commentary on every $5K GL account — only the ones that move the needle.</w:t>
       </w:r>
     </w:p>
     <w:p>

</xml_diff>